<commit_message>
AI-use statement: say that the manuscript text was drafted with AI assistance
Co-Authored-By: Claude Sonnet 5.5 <noreply@anthropic.com>
</commit_message>
<xml_diff>
--- a/manuscript/TNCC_Cellulose_Manuscript_v3.docx
+++ b/manuscript/TNCC_Cellulose_Manuscript_v3.docx
@@ -7129,7 +7129,7 @@
         <w:t>Use of generative AI and handling of evidence.</w:t>
       </w:r>
       <w:r>
-        <w:t xml:space="preserve"> Generative AI (Claude, Anthropic) was used as an assistive tool during manuscript preparation and software development, including code drafting, code review, figure-script drafting, scripts that retrieve literature records, and language editing. The author defined the research question, the requirements and the assumptions, directed the computational workflow and the verification criteria, reviewed the interpretation of the literature and approved every scientific conclusion. All computational results were generated by the deposited code and checked against the 58 automated verification checks described above; the author reviewed the outputs. No AI-generated data, references, experimental results or scientific conclusions were accepted without author verification, and the study reports no experimental data. No AI tool is an author. Every reference was resolved against its Crossref record by script, a final audit re-resolved every record and located each quoted number in the cited abstract where one was accessible (Supplementary Information S4), and, for references whose abstract could not be retrieved, the claim attached is limited to what the title states. Statements of absence rest on the documented searches in Supplementary Information S4. The author takes full responsibility for the accuracy, integrity and interpretation of the work.</w:t>
+        <w:t xml:space="preserve"> Generative AI (Claude, Anthropic) was used as an assistive tool during manuscript preparation and software development, including code drafting, code review, figure-script drafting, scripts that retrieve literature records, and drafting and language editing of the manuscript text. The author defined the research question, the requirements and the assumptions, directed the computational workflow and the verification criteria, reviewed the interpretation of the literature and approved every scientific conclusion. All computational results were generated by the deposited code and checked against the 58 automated verification checks described above; the author reviewed the outputs. No AI-generated data, references, experimental results or scientific conclusions were accepted without author verification, and the study reports no experimental data. No AI tool is an author. Every reference was resolved against its Crossref record by script, a final audit re-resolved every record and located each quoted number in the cited abstract where one was accessible (Supplementary Information S4), and, for references whose abstract could not be retrieved, the claim attached is limited to what the title states. Statements of absence rest on the documented searches in Supplementary Information S4. The author takes full responsibility for the accuracy, integrity and interpretation of the work.</w:t>
       </w:r>
     </w:p>
     <w:p>
@@ -15108,7 +15108,7 @@
         <w:t>Author contributions</w:t>
       </w:r>
       <w:r>
-        <w:t xml:space="preserve"> Leon Sandler conceived the study, specified the physical model and its assumptions, directed the literature work and the computation, analysed the results and wrote the manuscript.</w:t>
+        <w:t xml:space="preserve"> Leon Sandler conceived the study, specified the physical model and its assumptions, directed the literature work and the computation, analysed the results, and reviewed, edited and approved the manuscript.</w:t>
       </w:r>
     </w:p>
     <w:p>
@@ -15123,7 +15123,7 @@
         <w:t>Use of generative AI</w:t>
       </w:r>
       <w:r>
-        <w:t xml:space="preserve"> Generative AI (Claude, Anthropic) was used as an assistive tool for code drafting, code review, figure-script drafting, literature-record retrieval scripts and language editing. The author defined the research question, requirements and assumptions, directed the workflow and verification, reviewed the literature interpretation and approved all conclusions, and takes full responsibility for the work. No AI-generated data, references or conclusions were accepted without author verification (Section 5.5).</w:t>
+        <w:t xml:space="preserve"> Generative AI (Claude, Anthropic) was used as an assistive tool for code drafting, code review, figure-script drafting, literature-record retrieval scripts, and drafting and language editing of the manuscript text. The author defined the research question, requirements and assumptions, directed the workflow and verification, reviewed the literature interpretation and approved all conclusions, and takes full responsibility for the work. No AI-generated data, references or conclusions were accepted without author verification (Section 5.5).</w:t>
       </w:r>
     </w:p>
     <w:p>

</xml_diff>